<commit_message>
Career readiness portfolio and resume cleanup
</commit_message>
<xml_diff>
--- a/Resume/Resume_Master.docx
+++ b/Resume/Resume_Master.docx
@@ -9,6 +9,13 @@
         <w:jc w:val="center"/>
       </w:pPr>
       <w:r>
+        <w:rPr>
+          <w:rFonts w:ascii="Arial" w:hAnsi="Arial"/>
+          <w:b/>
+          <w:i w:val="0"/>
+          <w:color w:val="181D1B"/>
+          <w:sz w:val="46"/>
+        </w:rPr>
         <w:t>M. Shravan Kumar</w:t>
       </w:r>
     </w:p>
@@ -19,53 +26,96 @@
       </w:pPr>
       <w:r>
         <w:rPr>
+          <w:rFonts w:ascii="Arial" w:hAnsi="Arial"/>
           <w:b/>
-          <w:color w:val="135F48"/>
-          <w:sz w:val="21"/>
+          <w:i w:val="0"/>
+          <w:color w:val="0F6B58"/>
+          <w:sz w:val="23"/>
         </w:rPr>
         <w:t>AI PRODUCT MANAGER</w:t>
       </w:r>
     </w:p>
     <w:p>
       <w:pPr>
-        <w:spacing w:after="80"/>
+        <w:spacing w:after="0"/>
         <w:jc w:val="center"/>
-        <w:pBdr>
-          <w:bottom w:val="single" w:sz="8" w:space="3" w:color="176B54"/>
-        </w:pBdr>
       </w:pPr>
       <w:r>
-        <w:t xml:space="preserve">New Delhi, India  |  </w:t>
+        <w:rPr>
+          <w:rFonts w:ascii="Arial" w:hAnsi="Arial"/>
+          <w:b w:val="0"/>
+          <w:i w:val="0"/>
+          <w:color w:val="4C5652"/>
+          <w:sz w:val="18"/>
+        </w:rPr>
+        <w:t xml:space="preserve">New Delhi, India | +91 8130206607 | </w:t>
       </w:r>
-      <w:hyperlink r:id="rId9">
+      <w:hyperlink r:id="rId10">
         <w:r>
           <w:rPr>
-            <w:color w:val="176B54"/>
-            <w:u w:val="single"/>
+            <w:color w:val="0F6B58"/>
+            <w:u w:val="none"/>
+            <w:rFonts w:ascii="Arial" w:hAnsi="Arial"/>
+            <w:sz w:val="18"/>
+          </w:rPr>
+          <w:t>shravan.kumar9623@gmail.com</w:t>
+        </w:r>
+      </w:hyperlink>
+    </w:p>
+    <w:p>
+      <w:pPr>
+        <w:spacing w:after="160"/>
+        <w:jc w:val="center"/>
+      </w:pPr>
+      <w:hyperlink r:id="rId11">
+        <w:r>
+          <w:rPr>
+            <w:color w:val="0F6B58"/>
+            <w:u w:val="none"/>
+            <w:rFonts w:ascii="Arial" w:hAnsi="Arial"/>
+            <w:sz w:val="18"/>
           </w:rPr>
           <w:t>LinkedIn</w:t>
         </w:r>
       </w:hyperlink>
       <w:r>
-        <w:t xml:space="preserve">  |  </w:t>
+        <w:rPr>
+          <w:rFonts w:ascii="Arial" w:hAnsi="Arial"/>
+          <w:b w:val="0"/>
+          <w:i w:val="0"/>
+          <w:color w:val="4C5652"/>
+          <w:sz w:val="18"/>
+        </w:rPr>
+        <w:t xml:space="preserve"> | </w:t>
       </w:r>
-      <w:hyperlink r:id="rId10">
+      <w:hyperlink r:id="rId12">
         <w:r>
           <w:rPr>
-            <w:color w:val="176B54"/>
-            <w:u w:val="single"/>
+            <w:color w:val="0F6B58"/>
+            <w:u w:val="none"/>
+            <w:rFonts w:ascii="Arial" w:hAnsi="Arial"/>
+            <w:sz w:val="18"/>
           </w:rPr>
           <w:t>GitHub</w:t>
         </w:r>
       </w:hyperlink>
       <w:r>
-        <w:t xml:space="preserve">  |  </w:t>
+        <w:rPr>
+          <w:rFonts w:ascii="Arial" w:hAnsi="Arial"/>
+          <w:b w:val="0"/>
+          <w:i w:val="0"/>
+          <w:color w:val="4C5652"/>
+          <w:sz w:val="18"/>
+        </w:rPr>
+        <w:t xml:space="preserve"> | </w:t>
       </w:r>
-      <w:hyperlink r:id="rId11">
+      <w:hyperlink r:id="rId13">
         <w:r>
           <w:rPr>
-            <w:color w:val="176B54"/>
-            <w:u w:val="single"/>
+            <w:color w:val="0F6B58"/>
+            <w:u w:val="none"/>
+            <w:rFonts w:ascii="Arial" w:hAnsi="Arial"/>
+            <w:sz w:val="18"/>
           </w:rPr>
           <w:t>Portfolio</w:t>
         </w:r>
@@ -74,237 +124,390 @@
     <w:p>
       <w:pPr>
         <w:pStyle w:val="Heading1"/>
+        <w:keepNext/>
+        <w:spacing w:before="140" w:after="60"/>
       </w:pPr>
       <w:r>
-        <w:t>Executive Summary</w:t>
+        <w:rPr>
+          <w:rFonts w:ascii="Arial" w:hAnsi="Arial"/>
+          <w:b/>
+          <w:i w:val="0"/>
+          <w:color w:val="181D1B"/>
+          <w:sz w:val="21"/>
+        </w:rPr>
+        <w:t>PROFESSIONAL SUMMARY</w:t>
       </w:r>
     </w:p>
     <w:p>
+      <w:pPr>
+        <w:spacing w:after="80" w:line="252" w:lineRule="auto"/>
+      </w:pPr>
       <w:r>
-        <w:t>AI Product Manager with established experience across product management, EdTech, product operations, and AI-enabled workflow automation. Initiates products from real user and operating problems, defines strategy and requirements, designs human-in-the-loop workflows, and works hands-on across UX, AI/model decisions, evaluation, analytics, testing, and delivery.</w:t>
+        <w:rPr>
+          <w:rFonts w:ascii="Arial" w:hAnsi="Arial"/>
+          <w:b w:val="0"/>
+          <w:i w:val="0"/>
+          <w:color w:val="181D1B"/>
+          <w:sz w:val="19"/>
+        </w:rPr>
+        <w:t>AI Product Manager with 8+ years of experience across product management, EdTech, content strategy, project execution, product operations, and AI-enabled workflow automation. Translates complex business and user problems into product strategy, requirements, workflows, user stories, acceptance criteria, and execution plans. Combines product discovery and cross-functional delivery with hands-on work across UX, AI/model decisions, evaluation, analytics, testing, and implementation.</w:t>
       </w:r>
     </w:p>
     <w:p>
       <w:pPr>
         <w:pStyle w:val="Heading1"/>
+        <w:keepNext/>
+        <w:spacing w:before="140" w:after="60"/>
       </w:pPr>
       <w:r>
-        <w:t>Core AI and Product Capabilities</w:t>
+        <w:rPr>
+          <w:rFonts w:ascii="Arial" w:hAnsi="Arial"/>
+          <w:b/>
+          <w:i w:val="0"/>
+          <w:color w:val="181D1B"/>
+          <w:sz w:val="21"/>
+        </w:rPr>
+        <w:t>CORE AI AND PRODUCT CAPABILITIES</w:t>
       </w:r>
     </w:p>
     <w:p>
+      <w:pPr>
+        <w:spacing w:after="80" w:line="252" w:lineRule="auto"/>
+      </w:pPr>
       <w:r>
-        <w:t>AI Product Management · Product Strategy · Product Discovery · User Research · Roadmaps and Prioritization · PRDs and Acceptance Criteria · Generative AI and LLM Workflows · Human-in-the-Loop Systems · AI Evaluation · Experimentation · Product Analytics · Workflow Automation · UX Collaboration · Agile Delivery</w:t>
+        <w:rPr>
+          <w:rFonts w:ascii="Arial" w:hAnsi="Arial"/>
+          <w:b w:val="0"/>
+          <w:i w:val="0"/>
+          <w:color w:val="181D1B"/>
+          <w:sz w:val="18"/>
+        </w:rPr>
+        <w:t>AI Product Management | Product Management | Product Strategy | Product Discovery | Product Execution | Product Operations | Project/Program Execution | Content Strategy | EdTech and Academic Workflows | User Research | Roadmaps and Prioritization | PRDs and Acceptance Criteria | Generative AI and LLM Workflows | Human-in-the-Loop Systems | AI Evaluation | Experimentation | Product Analytics | Workflow Automation | UX Collaboration | Agile Delivery | Stakeholder Management</w:t>
       </w:r>
     </w:p>
     <w:p>
       <w:pPr>
         <w:pStyle w:val="Heading1"/>
+        <w:keepNext/>
+        <w:spacing w:before="140" w:after="60"/>
       </w:pPr>
       <w:r>
-        <w:t>Professional Experience</w:t>
+        <w:rPr>
+          <w:rFonts w:ascii="Arial" w:hAnsi="Arial"/>
+          <w:b/>
+          <w:i w:val="0"/>
+          <w:color w:val="181D1B"/>
+          <w:sz w:val="21"/>
+        </w:rPr>
+        <w:t>PROFESSIONAL EXPERIENCE</w:t>
       </w:r>
     </w:p>
     <w:p>
       <w:pPr>
-        <w:spacing w:before="64" w:after="0"/>
+        <w:keepNext/>
+        <w:spacing w:before="60" w:after="20"/>
       </w:pPr>
       <w:r>
         <w:rPr>
+          <w:rFonts w:ascii="Arial" w:hAnsi="Arial"/>
           <w:b/>
+          <w:i w:val="0"/>
+          <w:color w:val="181D1B"/>
+          <w:sz w:val="19"/>
         </w:rPr>
         <w:t>Physics Wallah</w:t>
       </w:r>
       <w:r>
         <w:rPr>
+          <w:rFonts w:ascii="Arial" w:hAnsi="Arial"/>
+          <w:b/>
           <w:i/>
+          <w:color w:val="181D1B"/>
+          <w:sz w:val="19"/>
         </w:rPr>
-        <w:t xml:space="preserve"> — Manager, Product (Platform &amp; Execution)</w:t>
-      </w:r>
-      <w:r>
-        <w:rPr>
-          <w:b/>
-        </w:rPr>
-        <w:t xml:space="preserve">  |  May 2023 – Present</w:t>
+        <w:t xml:space="preserve"> - Manager, Product (Platform &amp; Execution) | May 2023 - Present</w:t>
       </w:r>
     </w:p>
     <w:p>
       <w:pPr>
         <w:pStyle w:val="ListBullet"/>
-        <w:spacing w:after="20"/>
-        <w:ind w:left="238" w:hanging="125"/>
+        <w:spacing w:after="28" w:line="245" w:lineRule="auto"/>
+        <w:ind w:left="259" w:hanging="173"/>
       </w:pPr>
       <w:r>
+        <w:rPr>
+          <w:rFonts w:ascii="Arial" w:hAnsi="Arial"/>
+          <w:b w:val="0"/>
+          <w:i w:val="0"/>
+          <w:color w:val="181D1B"/>
+          <w:sz w:val="18"/>
+        </w:rPr>
         <w:t>Own product execution for educational platforms and internal workflows, translating business and user needs into product specifications, user stories, acceptance criteria, and prioritized delivery plans.</w:t>
       </w:r>
     </w:p>
     <w:p>
       <w:pPr>
         <w:pStyle w:val="ListBullet"/>
-        <w:spacing w:after="20"/>
-        <w:ind w:left="238" w:hanging="125"/>
+        <w:spacing w:after="28" w:line="245" w:lineRule="auto"/>
+        <w:ind w:left="259" w:hanging="173"/>
       </w:pPr>
       <w:r>
+        <w:rPr>
+          <w:rFonts w:ascii="Arial" w:hAnsi="Arial"/>
+          <w:b w:val="0"/>
+          <w:i w:val="0"/>
+          <w:color w:val="181D1B"/>
+          <w:sz w:val="18"/>
+        </w:rPr>
         <w:t>Lead product discovery, requirements, workflow design, UX decisions, testing, and iteration for AI-enabled and operational products.</w:t>
       </w:r>
     </w:p>
     <w:p>
       <w:pPr>
         <w:pStyle w:val="ListBullet"/>
-        <w:spacing w:after="20"/>
-        <w:ind w:left="238" w:hanging="125"/>
+        <w:spacing w:after="28" w:line="245" w:lineRule="auto"/>
+        <w:ind w:left="259" w:hanging="173"/>
       </w:pPr>
       <w:r>
+        <w:rPr>
+          <w:rFonts w:ascii="Arial" w:hAnsi="Arial"/>
+          <w:b w:val="0"/>
+          <w:i w:val="0"/>
+          <w:color w:val="181D1B"/>
+          <w:sz w:val="18"/>
+        </w:rPr>
         <w:t>Coordinate managers as evaluators and teammates as testers, using structured feedback and validation to guide product decisions.</w:t>
       </w:r>
     </w:p>
     <w:p>
       <w:pPr>
         <w:pStyle w:val="ListBullet"/>
-        <w:spacing w:after="20"/>
-        <w:ind w:left="238" w:hanging="125"/>
+        <w:spacing w:after="28" w:line="245" w:lineRule="auto"/>
+        <w:ind w:left="259" w:hanging="173"/>
       </w:pPr>
       <w:r>
+        <w:rPr>
+          <w:rFonts w:ascii="Arial" w:hAnsi="Arial"/>
+          <w:b w:val="0"/>
+          <w:i w:val="0"/>
+          <w:color w:val="181D1B"/>
+          <w:sz w:val="18"/>
+        </w:rPr>
         <w:t>Partner across product, design, operations, and technology to move initiatives from problem definition through delivery and review.</w:t>
       </w:r>
     </w:p>
     <w:p>
       <w:pPr>
-        <w:spacing w:before="64" w:after="0"/>
+        <w:keepNext/>
+        <w:spacing w:before="60" w:after="20"/>
       </w:pPr>
       <w:r>
         <w:rPr>
+          <w:rFonts w:ascii="Arial" w:hAnsi="Arial"/>
           <w:b/>
+          <w:i w:val="0"/>
+          <w:color w:val="181D1B"/>
+          <w:sz w:val="19"/>
         </w:rPr>
         <w:t>Unacademy (Incounse)</w:t>
       </w:r>
       <w:r>
         <w:rPr>
+          <w:rFonts w:ascii="Arial" w:hAnsi="Arial"/>
+          <w:b/>
           <w:i/>
+          <w:color w:val="181D1B"/>
+          <w:sz w:val="19"/>
         </w:rPr>
-        <w:t xml:space="preserve"> — Associate Manager, Product</w:t>
-      </w:r>
-      <w:r>
-        <w:rPr>
-          <w:b/>
-        </w:rPr>
-        <w:t xml:space="preserve">  |  April 2021 – April 2023</w:t>
+        <w:t xml:space="preserve"> - Associate Manager, Product | April 2021 - April 2023</w:t>
       </w:r>
     </w:p>
     <w:p>
       <w:pPr>
         <w:pStyle w:val="ListBullet"/>
-        <w:spacing w:after="20"/>
-        <w:ind w:left="238" w:hanging="125"/>
+        <w:spacing w:after="28" w:line="245" w:lineRule="auto"/>
+        <w:ind w:left="259" w:hanging="173"/>
       </w:pPr>
       <w:r>
+        <w:rPr>
+          <w:rFonts w:ascii="Arial" w:hAnsi="Arial"/>
+          <w:b w:val="0"/>
+          <w:i w:val="0"/>
+          <w:color w:val="181D1B"/>
+          <w:sz w:val="18"/>
+        </w:rPr>
         <w:t>Owned roadmap execution for interactive 3D visualization capabilities supporting digital learning experiences.</w:t>
       </w:r>
     </w:p>
     <w:p>
       <w:pPr>
         <w:pStyle w:val="ListBullet"/>
-        <w:spacing w:after="20"/>
-        <w:ind w:left="238" w:hanging="125"/>
+        <w:spacing w:after="28" w:line="245" w:lineRule="auto"/>
+        <w:ind w:left="259" w:hanging="173"/>
       </w:pPr>
       <w:r>
-        <w:t>Established student-feedback and usage-review workflows to inform backlog prioritization and product iteration.</w:t>
+        <w:rPr>
+          <w:rFonts w:ascii="Arial" w:hAnsi="Arial"/>
+          <w:b w:val="0"/>
+          <w:i w:val="0"/>
+          <w:color w:val="181D1B"/>
+          <w:sz w:val="18"/>
+        </w:rPr>
+        <w:t>Established continuous student-feedback and usage-review workflows to inform backlog prioritization and product iteration.</w:t>
       </w:r>
     </w:p>
     <w:p>
       <w:pPr>
         <w:pStyle w:val="ListBullet"/>
-        <w:spacing w:after="20"/>
-        <w:ind w:left="238" w:hanging="125"/>
+        <w:spacing w:after="28" w:line="245" w:lineRule="auto"/>
+        <w:ind w:left="259" w:hanging="173"/>
       </w:pPr>
       <w:r>
+        <w:rPr>
+          <w:rFonts w:ascii="Arial" w:hAnsi="Arial"/>
+          <w:b w:val="0"/>
+          <w:i w:val="0"/>
+          <w:color w:val="181D1B"/>
+          <w:sz w:val="18"/>
+        </w:rPr>
         <w:t>Implemented dynamic QR-based digital integrations and contributed to sprint planning, demos, retrospectives, and cross-functional delivery.</w:t>
       </w:r>
     </w:p>
     <w:p>
       <w:pPr>
-        <w:spacing w:before="64" w:after="0"/>
+        <w:keepNext/>
+        <w:spacing w:before="60" w:after="20"/>
       </w:pPr>
       <w:r>
         <w:rPr>
+          <w:rFonts w:ascii="Arial" w:hAnsi="Arial"/>
           <w:b/>
+          <w:i w:val="0"/>
+          <w:color w:val="181D1B"/>
+          <w:sz w:val="19"/>
         </w:rPr>
         <w:t>Yami Cosmo Services Pvt. Ltd.</w:t>
       </w:r>
       <w:r>
         <w:rPr>
+          <w:rFonts w:ascii="Arial" w:hAnsi="Arial"/>
+          <w:b/>
           <w:i/>
+          <w:color w:val="181D1B"/>
+          <w:sz w:val="19"/>
         </w:rPr>
-        <w:t xml:space="preserve"> — Co-Owner, Product &amp; Operations</w:t>
-      </w:r>
-      <w:r>
-        <w:rPr>
-          <w:b/>
-        </w:rPr>
-        <w:t xml:space="preserve">  |  June 2019 – March 2021</w:t>
+        <w:t xml:space="preserve"> - Co-Owner, Product &amp; Operations | June 2019 - March 2021</w:t>
       </w:r>
     </w:p>
     <w:p>
       <w:pPr>
         <w:pStyle w:val="ListBullet"/>
-        <w:spacing w:after="20"/>
-        <w:ind w:left="238" w:hanging="125"/>
+        <w:spacing w:after="28" w:line="245" w:lineRule="auto"/>
+        <w:ind w:left="259" w:hanging="173"/>
       </w:pPr>
       <w:r>
+        <w:rPr>
+          <w:rFonts w:ascii="Arial" w:hAnsi="Arial"/>
+          <w:b w:val="0"/>
+          <w:i w:val="0"/>
+          <w:color w:val="181D1B"/>
+          <w:sz w:val="18"/>
+        </w:rPr>
         <w:t>Led product and operations planning across service delivery, process improvement, and customer experience.</w:t>
       </w:r>
     </w:p>
     <w:p>
       <w:pPr>
         <w:pStyle w:val="ListBullet"/>
-        <w:spacing w:after="20"/>
-        <w:ind w:left="238" w:hanging="125"/>
+        <w:spacing w:after="28" w:line="245" w:lineRule="auto"/>
+        <w:ind w:left="259" w:hanging="173"/>
       </w:pPr>
       <w:r>
+        <w:rPr>
+          <w:rFonts w:ascii="Arial" w:hAnsi="Arial"/>
+          <w:b w:val="0"/>
+          <w:i w:val="0"/>
+          <w:color w:val="181D1B"/>
+          <w:sz w:val="18"/>
+        </w:rPr>
         <w:t>Identified workflow constraints, prioritized operational improvements, and coordinated delivery across business needs.</w:t>
       </w:r>
     </w:p>
     <w:p>
       <w:pPr>
-        <w:spacing w:before="64" w:after="0"/>
+        <w:keepNext/>
+        <w:spacing w:before="60" w:after="20"/>
       </w:pPr>
       <w:r>
         <w:rPr>
+          <w:rFonts w:ascii="Arial" w:hAnsi="Arial"/>
           <w:b/>
+          <w:i w:val="0"/>
+          <w:color w:val="181D1B"/>
+          <w:sz w:val="19"/>
         </w:rPr>
         <w:t>BYJU'S</w:t>
       </w:r>
       <w:r>
         <w:rPr>
+          <w:rFonts w:ascii="Arial" w:hAnsi="Arial"/>
+          <w:b/>
           <w:i/>
+          <w:color w:val="181D1B"/>
+          <w:sz w:val="19"/>
         </w:rPr>
-        <w:t xml:space="preserve"> — Content Strategist, Product Support</w:t>
-      </w:r>
-      <w:r>
-        <w:rPr>
-          <w:b/>
-        </w:rPr>
-        <w:t xml:space="preserve">  |  July 2017 – June 2019</w:t>
+        <w:t xml:space="preserve"> - Content Strategist, Product Support | July 2017 - June 2019</w:t>
       </w:r>
     </w:p>
     <w:p>
       <w:pPr>
         <w:pStyle w:val="ListBullet"/>
-        <w:spacing w:after="20"/>
-        <w:ind w:left="238" w:hanging="125"/>
+        <w:spacing w:after="28" w:line="245" w:lineRule="auto"/>
+        <w:ind w:left="259" w:hanging="173"/>
       </w:pPr>
       <w:r>
+        <w:rPr>
+          <w:rFonts w:ascii="Arial" w:hAnsi="Arial"/>
+          <w:b w:val="0"/>
+          <w:i w:val="0"/>
+          <w:color w:val="181D1B"/>
+          <w:sz w:val="18"/>
+        </w:rPr>
         <w:t>Designed structured content workflows with documentation, validation, and quality-control checkpoints.</w:t>
       </w:r>
     </w:p>
     <w:p>
       <w:pPr>
         <w:pStyle w:val="ListBullet"/>
-        <w:spacing w:after="20"/>
-        <w:ind w:left="238" w:hanging="125"/>
+        <w:spacing w:after="28" w:line="245" w:lineRule="auto"/>
+        <w:ind w:left="259" w:hanging="173"/>
       </w:pPr>
       <w:r>
+        <w:rPr>
+          <w:rFonts w:ascii="Arial" w:hAnsi="Arial"/>
+          <w:b w:val="0"/>
+          <w:i w:val="0"/>
+          <w:color w:val="181D1B"/>
+          <w:sz w:val="18"/>
+        </w:rPr>
         <w:t>Collaborated across teams to maintain content consistency, quality standards, and release readiness.</w:t>
+      </w:r>
+    </w:p>
+    <w:p>
+      <w:pPr>
+        <w:pStyle w:val="ListBullet"/>
+        <w:spacing w:after="28" w:line="245" w:lineRule="auto"/>
+        <w:ind w:left="259" w:hanging="173"/>
+      </w:pPr>
+      <w:r>
+        <w:rPr>
+          <w:rFonts w:ascii="Arial" w:hAnsi="Arial"/>
+          <w:b w:val="0"/>
+          <w:i w:val="0"/>
+          <w:color w:val="181D1B"/>
+          <w:sz w:val="18"/>
+        </w:rPr>
+        <w:t>Supported blended digital learning experiences through content strategy, product support, and operational execution.</w:t>
       </w:r>
     </w:p>
     <w:p>
@@ -315,219 +518,436 @@
     <w:p>
       <w:pPr>
         <w:pStyle w:val="Heading1"/>
+        <w:keepNext/>
+        <w:spacing w:before="140" w:after="60"/>
       </w:pPr>
       <w:r>
-        <w:t>Selected AI Product Experience</w:t>
+        <w:rPr>
+          <w:rFonts w:ascii="Arial" w:hAnsi="Arial"/>
+          <w:b/>
+          <w:i w:val="0"/>
+          <w:color w:val="181D1B"/>
+          <w:sz w:val="21"/>
+        </w:rPr>
+        <w:t>SELECTED AI PRODUCT EXPERIENCE</w:t>
       </w:r>
     </w:p>
     <w:p>
       <w:pPr>
-        <w:spacing w:before="70" w:after="0"/>
+        <w:keepNext/>
+        <w:spacing w:before="60" w:after="20"/>
       </w:pPr>
       <w:r>
         <w:rPr>
+          <w:rFonts w:ascii="Arial" w:hAnsi="Arial"/>
           <w:b/>
+          <w:i w:val="0"/>
+          <w:color w:val="181D1B"/>
+          <w:sz w:val="19"/>
         </w:rPr>
         <w:t>AI Video Solution Generator</w:t>
       </w:r>
       <w:r>
         <w:rPr>
+          <w:rFonts w:ascii="Arial" w:hAnsi="Arial"/>
+          <w:b/>
           <w:i/>
+          <w:color w:val="181D1B"/>
+          <w:sz w:val="19"/>
         </w:rPr>
-        <w:t xml:space="preserve"> — AI Product Manager | March 2026 – Present</w:t>
+        <w:t xml:space="preserve"> - AI Product Manager | March 2026 - Present</w:t>
       </w:r>
     </w:p>
     <w:p>
       <w:pPr>
         <w:pStyle w:val="ListBullet"/>
-        <w:spacing w:after="20"/>
-        <w:ind w:left="238" w:hanging="125"/>
+        <w:spacing w:after="28" w:line="245" w:lineRule="auto"/>
+        <w:ind w:left="259" w:hanging="173"/>
       </w:pPr>
       <w:r>
-        <w:t>Initiated and led a faculty-reviewed workflow from source/question paper through AI processing, solution work, video generation, human review, and final output.</w:t>
+        <w:rPr>
+          <w:rFonts w:ascii="Arial" w:hAnsi="Arial"/>
+          <w:b w:val="0"/>
+          <w:i w:val="0"/>
+          <w:color w:val="181D1B"/>
+          <w:sz w:val="18"/>
+        </w:rPr>
+        <w:t>Initiated and led a faculty-reviewed workflow from source/question paper through AI processing, extraction, solution matching or generation, video generation, human review, and final output.</w:t>
       </w:r>
     </w:p>
     <w:p>
       <w:pPr>
         <w:pStyle w:val="ListBullet"/>
-        <w:spacing w:after="20"/>
-        <w:ind w:left="238" w:hanging="125"/>
+        <w:spacing w:after="28" w:line="245" w:lineRule="auto"/>
+        <w:ind w:left="259" w:hanging="173"/>
       </w:pPr>
       <w:r>
-        <w:t>Owned discovery, requirements, workflow, UX/UI, AI/model decisions, testing, evaluation, and end-to-end validation; contributed directly to implementation using Claude and Codex assistance.</w:t>
+        <w:rPr>
+          <w:rFonts w:ascii="Arial" w:hAnsi="Arial"/>
+          <w:b w:val="0"/>
+          <w:i w:val="0"/>
+          <w:color w:val="181D1B"/>
+          <w:sz w:val="18"/>
+        </w:rPr>
+        <w:t>Owned discovery, requirements, workflow and UX/UI decisions, AI/model decisions, testing, evaluation, and end-to-end validation.</w:t>
       </w:r>
     </w:p>
     <w:p>
       <w:pPr>
-        <w:spacing w:before="70" w:after="0"/>
+        <w:pStyle w:val="ListBullet"/>
+        <w:spacing w:after="28" w:line="245" w:lineRule="auto"/>
+        <w:ind w:left="259" w:hanging="173"/>
       </w:pPr>
       <w:r>
         <w:rPr>
+          <w:rFonts w:ascii="Arial" w:hAnsi="Arial"/>
+          <w:b w:val="0"/>
+          <w:i w:val="0"/>
+          <w:color w:val="181D1B"/>
+          <w:sz w:val="18"/>
+        </w:rPr>
+        <w:t>Contributed directly to implementation through AI-assisted development while coordinating manager evaluation and teammate testing.</w:t>
+      </w:r>
+    </w:p>
+    <w:p>
+      <w:pPr>
+        <w:keepNext/>
+        <w:spacing w:before="60" w:after="20"/>
+      </w:pPr>
+      <w:r>
+        <w:rPr>
+          <w:rFonts w:ascii="Arial" w:hAnsi="Arial"/>
           <w:b/>
+          <w:i w:val="0"/>
+          <w:color w:val="181D1B"/>
+          <w:sz w:val="19"/>
         </w:rPr>
         <w:t>Workforce Operations Platform</w:t>
       </w:r>
       <w:r>
         <w:rPr>
+          <w:rFonts w:ascii="Arial" w:hAnsi="Arial"/>
+          <w:b/>
           <w:i/>
+          <w:color w:val="181D1B"/>
+          <w:sz w:val="19"/>
         </w:rPr>
-        <w:t xml:space="preserve"> — AI Product Manager | June 2026 – Present</w:t>
+        <w:t xml:space="preserve"> - AI Product Manager | June 2026 - Present</w:t>
       </w:r>
     </w:p>
     <w:p>
       <w:pPr>
         <w:pStyle w:val="ListBullet"/>
-        <w:spacing w:after="20"/>
-        <w:ind w:left="238" w:hanging="125"/>
+        <w:spacing w:after="28" w:line="245" w:lineRule="auto"/>
+        <w:ind w:left="259" w:hanging="173"/>
       </w:pPr>
       <w:r>
+        <w:rPr>
+          <w:rFonts w:ascii="Arial" w:hAnsi="Arial"/>
+          <w:b w:val="0"/>
+          <w:i w:val="0"/>
+          <w:color w:val="181D1B"/>
+          <w:sz w:val="18"/>
+        </w:rPr>
         <w:t>Initiated and defined a role-aware product for faculty, managers, and DTP users spanning attendance, time, projects, approvals, reporting, and productivity workflows.</w:t>
       </w:r>
     </w:p>
     <w:p>
       <w:pPr>
         <w:pStyle w:val="ListBullet"/>
-        <w:spacing w:after="20"/>
-        <w:ind w:left="238" w:hanging="125"/>
+        <w:spacing w:after="28" w:line="245" w:lineRule="auto"/>
+        <w:ind w:left="259" w:hanging="173"/>
       </w:pPr>
       <w:r>
-        <w:t>Owned requirements, workflow architecture, UI/UX, data interlinking, AI-related functionality, testing, and validation; contributed directly to the TypeScript application.</w:t>
+        <w:rPr>
+          <w:rFonts w:ascii="Arial" w:hAnsi="Arial"/>
+          <w:b w:val="0"/>
+          <w:i w:val="0"/>
+          <w:color w:val="181D1B"/>
+          <w:sz w:val="18"/>
+        </w:rPr>
+        <w:t>Owned requirements, workflow architecture, UI/UX, data interlinking, AI-related functionality, testing, and validation.</w:t>
       </w:r>
     </w:p>
     <w:p>
       <w:pPr>
-        <w:spacing w:before="70" w:after="0"/>
+        <w:pStyle w:val="ListBullet"/>
+        <w:spacing w:after="28" w:line="245" w:lineRule="auto"/>
+        <w:ind w:left="259" w:hanging="173"/>
       </w:pPr>
       <w:r>
         <w:rPr>
+          <w:rFonts w:ascii="Arial" w:hAnsi="Arial"/>
+          <w:b w:val="0"/>
+          <w:i w:val="0"/>
+          <w:color w:val="181D1B"/>
+          <w:sz w:val="18"/>
+        </w:rPr>
+        <w:t>Contributed directly to the TypeScript application, including authenticated workflows, role-based controls, reporting, and AI efficiency/costing views.</w:t>
+      </w:r>
+    </w:p>
+    <w:p>
+      <w:pPr>
+        <w:keepNext/>
+        <w:spacing w:before="60" w:after="20"/>
+      </w:pPr>
+      <w:r>
+        <w:rPr>
+          <w:rFonts w:ascii="Arial" w:hAnsi="Arial"/>
           <w:b/>
+          <w:i w:val="0"/>
+          <w:color w:val="181D1B"/>
+          <w:sz w:val="19"/>
         </w:rPr>
         <w:t>QPG Tagging Automation</w:t>
       </w:r>
       <w:r>
         <w:rPr>
+          <w:rFonts w:ascii="Arial" w:hAnsi="Arial"/>
+          <w:b/>
           <w:i/>
+          <w:color w:val="181D1B"/>
+          <w:sz w:val="19"/>
         </w:rPr>
-        <w:t xml:space="preserve"> — AI Product Manager</w:t>
+        <w:t xml:space="preserve"> - AI Product Manager</w:t>
       </w:r>
     </w:p>
     <w:p>
       <w:pPr>
         <w:pStyle w:val="ListBullet"/>
-        <w:spacing w:after="20"/>
-        <w:ind w:left="238" w:hanging="125"/>
+        <w:spacing w:after="28" w:line="245" w:lineRule="auto"/>
+        <w:ind w:left="259" w:hanging="173"/>
       </w:pPr>
       <w:r>
+        <w:rPr>
+          <w:rFonts w:ascii="Arial" w:hAnsi="Arial"/>
+          <w:b w:val="0"/>
+          <w:i w:val="0"/>
+          <w:color w:val="181D1B"/>
+          <w:sz w:val="18"/>
+        </w:rPr>
         <w:t>Designed the DTP and faculty workflow for DOCX/PDF question ingestion, controlled Chapter/Topic/Subtopic/category tagging, and bulk video-solution attachment.</w:t>
       </w:r>
     </w:p>
     <w:p>
       <w:pPr>
         <w:pStyle w:val="ListBullet"/>
-        <w:spacing w:after="20"/>
-        <w:ind w:left="238" w:hanging="125"/>
+        <w:spacing w:after="28" w:line="245" w:lineRule="auto"/>
+        <w:ind w:left="259" w:hanging="173"/>
       </w:pPr>
       <w:r>
+        <w:rPr>
+          <w:rFonts w:ascii="Arial" w:hAnsi="Arial"/>
+          <w:b w:val="0"/>
+          <w:i w:val="0"/>
+          <w:color w:val="181D1B"/>
+          <w:sz w:val="18"/>
+        </w:rPr>
         <w:t>Designed preview, validation, dry-run, and explicit write controls so AI proposals remain bounded by approved taxonomy choices and accountable human review.</w:t>
       </w:r>
     </w:p>
     <w:p>
       <w:pPr>
-        <w:spacing w:before="70" w:after="0"/>
+        <w:keepNext/>
+        <w:spacing w:before="60" w:after="20"/>
       </w:pPr>
       <w:r>
         <w:rPr>
+          <w:rFonts w:ascii="Arial" w:hAnsi="Arial"/>
           <w:b/>
+          <w:i w:val="0"/>
+          <w:color w:val="181D1B"/>
+          <w:sz w:val="19"/>
         </w:rPr>
         <w:t>Leaderboard Generator</w:t>
       </w:r>
       <w:r>
         <w:rPr>
+          <w:rFonts w:ascii="Arial" w:hAnsi="Arial"/>
+          <w:b/>
           <w:i/>
+          <w:color w:val="181D1B"/>
+          <w:sz w:val="19"/>
         </w:rPr>
-        <w:t xml:space="preserve"> — AI Product Manager | August 2026 – Present</w:t>
+        <w:t xml:space="preserve"> - AI Product Manager | August 2026 - Present</w:t>
       </w:r>
     </w:p>
     <w:p>
       <w:pPr>
         <w:pStyle w:val="ListBullet"/>
-        <w:spacing w:after="20"/>
-        <w:ind w:left="238" w:hanging="125"/>
+        <w:spacing w:after="28" w:line="245" w:lineRule="auto"/>
+        <w:ind w:left="259" w:hanging="173"/>
       </w:pPr>
       <w:r>
+        <w:rPr>
+          <w:rFonts w:ascii="Arial" w:hAnsi="Arial"/>
+          <w:b w:val="0"/>
+          <w:i w:val="0"/>
+          <w:color w:val="181D1B"/>
+          <w:sz w:val="18"/>
+        </w:rPr>
         <w:t>Initiated, designed, and built a local Python/Streamlit product that converts variable spreadsheet inputs into editable PowerPoint result decks.</w:t>
       </w:r>
     </w:p>
     <w:p>
       <w:pPr>
         <w:pStyle w:val="ListBullet"/>
-        <w:spacing w:after="20"/>
-        <w:ind w:left="238" w:hanging="125"/>
+        <w:spacing w:after="28" w:line="245" w:lineRule="auto"/>
+        <w:ind w:left="259" w:hanging="173"/>
       </w:pPr>
       <w:r>
+        <w:rPr>
+          <w:rFonts w:ascii="Arial" w:hAnsi="Arial"/>
+          <w:b w:val="0"/>
+          <w:i w:val="0"/>
+          <w:color w:val="181D1B"/>
+          <w:sz w:val="18"/>
+        </w:rPr>
         <w:t>Designed schema handling, ranking and tie rules, analytics, presentation modes, batch processing, and automated correctness and layout validation while keeping student data local.</w:t>
       </w:r>
     </w:p>
     <w:p>
       <w:pPr>
         <w:pStyle w:val="Heading1"/>
+        <w:keepNext/>
+        <w:spacing w:before="140" w:after="60"/>
       </w:pPr>
       <w:r>
-        <w:t>Education</w:t>
+        <w:rPr>
+          <w:rFonts w:ascii="Arial" w:hAnsi="Arial"/>
+          <w:b/>
+          <w:i w:val="0"/>
+          <w:color w:val="181D1B"/>
+          <w:sz w:val="21"/>
+        </w:rPr>
+        <w:t>EDUCATION</w:t>
       </w:r>
     </w:p>
     <w:p>
+      <w:pPr>
+        <w:spacing w:after="40" w:line="252" w:lineRule="auto"/>
+      </w:pPr>
       <w:r>
-        <w:t>MBA, Liverpool Business School (UpGrad)  |  Bachelor of Life Science, University of Delhi</w:t>
+        <w:rPr>
+          <w:rFonts w:ascii="Arial" w:hAnsi="Arial"/>
+          <w:b w:val="0"/>
+          <w:i w:val="0"/>
+          <w:color w:val="181D1B"/>
+          <w:sz w:val="19"/>
+        </w:rPr>
+        <w:t>MBA, Liverpool Business School (UpGrad) | Bachelor of Life Science, University of Delhi</w:t>
       </w:r>
     </w:p>
     <w:p>
       <w:pPr>
         <w:pStyle w:val="Heading1"/>
+        <w:keepNext/>
+        <w:spacing w:before="140" w:after="60"/>
       </w:pPr>
       <w:r>
-        <w:t>Certification</w:t>
+        <w:rPr>
+          <w:rFonts w:ascii="Arial" w:hAnsi="Arial"/>
+          <w:b/>
+          <w:i w:val="0"/>
+          <w:color w:val="181D1B"/>
+          <w:sz w:val="21"/>
+        </w:rPr>
+        <w:t>CERTIFICATION</w:t>
       </w:r>
     </w:p>
     <w:p>
+      <w:pPr>
+        <w:spacing w:after="40" w:line="252" w:lineRule="auto"/>
+      </w:pPr>
       <w:r>
-        <w:t>Fundamentals of Agents — Unit 1, Hugging Face Agents Course, issued 11 August 2026</w:t>
+        <w:rPr>
+          <w:rFonts w:ascii="Arial" w:hAnsi="Arial"/>
+          <w:b w:val="0"/>
+          <w:i w:val="0"/>
+          <w:color w:val="181D1B"/>
+          <w:sz w:val="19"/>
+        </w:rPr>
+        <w:t>Fundamentals of Agents - Unit 1, Hugging Face Agents Course, issued 11 August 2026</w:t>
       </w:r>
     </w:p>
     <w:p>
       <w:pPr>
         <w:pStyle w:val="Heading1"/>
+        <w:keepNext/>
+        <w:spacing w:before="140" w:after="60"/>
       </w:pPr>
       <w:r>
-        <w:t>Tools and Technical Fluency</w:t>
-      </w:r>
-    </w:p>
-    <w:p>
-      <w:r>
-        <w:t>Python · TypeScript · React · Next.js · Streamlit · LLM integrations · RAG concepts · APIs · Data workflows · SQL/data modeling · Git/GitHub · Vercel · Figma · Jira · Miro · Microsoft Excel · PowerPoint · Google Workspace</w:t>
+        <w:rPr>
+          <w:rFonts w:ascii="Arial" w:hAnsi="Arial"/>
+          <w:b/>
+          <w:i w:val="0"/>
+          <w:color w:val="181D1B"/>
+          <w:sz w:val="21"/>
+        </w:rPr>
+        <w:t>TOOLS AND TECHNICAL FLUENCY</w:t>
       </w:r>
     </w:p>
     <w:p>
       <w:pPr>
-        <w:spacing w:before="120" w:after="0"/>
+        <w:spacing w:after="20" w:line="252" w:lineRule="auto"/>
       </w:pPr>
       <w:r>
         <w:rPr>
-          <w:i/>
-          <w:color w:val="5C6762"/>
-          <w:sz w:val="15"/>
+          <w:rFonts w:ascii="Arial" w:hAnsi="Arial"/>
+          <w:b w:val="0"/>
+          <w:i w:val="0"/>
+          <w:color w:val="181D1B"/>
+          <w:sz w:val="18"/>
         </w:rPr>
-        <w:t>Evidence note: This resume excludes unvalidated adoption, productivity, cost, retention, revenue, completion, and model-performance figures.</w:t>
+        <w:t>Python | TypeScript | React | Next.js | Streamlit | LLM integrations | RAG concepts | APIs | Data workflows | SQL/data modeling | Git/GitHub | Vercel | Figma | Jira | Miro | Microsoft Excel | PowerPoint | Google Workspace</w:t>
+      </w:r>
+    </w:p>
+    <w:p>
+      <w:pPr>
+        <w:spacing w:before="40" w:after="0"/>
+      </w:pPr>
+      <w:r>
+        <w:rPr>
+          <w:rFonts w:ascii="Arial" w:hAnsi="Arial"/>
+          <w:b w:val="0"/>
+          <w:i w:val="0"/>
+          <w:color w:val="181D1B"/>
+          <w:sz w:val="18"/>
+        </w:rPr>
+        <w:t>Languages: Tamil (Native), Hindi, English</w:t>
       </w:r>
     </w:p>
     <w:sectPr>
-      <w:pgSz w:w="11906" w:h="16838"/>
-      <w:pgMar w:top="709" w:right="822" w:bottom="709" w:left="822" w:header="720" w:footer="720" w:gutter="0"/>
+      <w:footerReference w:type="default" r:id="rId9"/>
+      <w:pgSz w:w="11909" w:h="16834"/>
+      <w:pgMar w:top="749" w:right="893" w:bottom="720" w:left="893" w:header="288" w:footer="360" w:gutter="0"/>
       <w:cols w:space="720"/>
       <w:docGrid w:linePitch="360"/>
     </w:sectPr>
   </w:body>
 </w:document>
+</file>
+
+<file path=word/footer1.xml><?xml version="1.0" encoding="utf-8"?>
+<w:ftr xmlns:m="http://schemas.openxmlformats.org/officeDocument/2006/math" xmlns:mc="http://schemas.openxmlformats.org/markup-compatibility/2006" xmlns:mo="http://schemas.microsoft.com/office/mac/office/2008/main" xmlns:mv="urn:schemas-microsoft-com:mac:vml" xmlns:o="urn:schemas-microsoft-com:office:office" xmlns:r="http://schemas.openxmlformats.org/officeDocument/2006/relationships" xmlns:v="urn:schemas-microsoft-com:vml" xmlns:w10="urn:schemas-microsoft-com:office:word" xmlns:w14="http://schemas.microsoft.com/office/word/2010/wordml" xmlns:w="http://schemas.openxmlformats.org/wordprocessingml/2006/main" xmlns:wne="http://schemas.microsoft.com/office/word/2006/wordml" xmlns:wp14="http://schemas.microsoft.com/office/word/2010/wordprocessingDrawing" xmlns:wp="http://schemas.openxmlformats.org/drawingml/2006/wordprocessingDrawing" xmlns:wpc="http://schemas.microsoft.com/office/word/2010/wordprocessingCanvas" xmlns:wpg="http://schemas.microsoft.com/office/word/2010/wordprocessingGroup" xmlns:wpi="http://schemas.microsoft.com/office/word/2010/wordprocessingInk" xmlns:wps="http://schemas.microsoft.com/office/word/2010/wordprocessingShape" mc:Ignorable="w14 wp14">
+  <w:p>
+    <w:pPr>
+      <w:pStyle w:val="Footer"/>
+      <w:spacing w:before="80"/>
+      <w:jc w:val="right"/>
+    </w:pPr>
+    <w:r>
+      <w:rPr>
+        <w:rFonts w:ascii="Arial" w:hAnsi="Arial"/>
+        <w:b w:val="0"/>
+        <w:i w:val="0"/>
+        <w:color w:val="4C5652"/>
+        <w:sz w:val="16"/>
+      </w:rPr>
+      <w:t>M. Shravan Kumar</w:t>
+    </w:r>
+  </w:p>
+</w:ftr>
 </file>
 
 <file path=word/numbering.xml><?xml version="1.0" encoding="utf-8"?>
@@ -894,12 +1314,12 @@
     <w:qFormat/>
     <w:rsid w:val="00FC693F"/>
     <w:pPr>
-      <w:spacing w:after="40" w:line="245" w:lineRule="auto"/>
+      <w:spacing w:after="40"/>
     </w:pPr>
     <w:rPr>
       <w:rFonts w:ascii="Arial" w:hAnsi="Arial"/>
-      <w:color w:val="212725"/>
-      <w:sz w:val="17"/>
+      <w:color w:val="181D1B"/>
+      <w:sz w:val="19"/>
     </w:rPr>
   </w:style>
   <w:style w:type="paragraph" w:styleId="Header">
@@ -957,15 +1377,14 @@
     <w:pPr>
       <w:keepNext/>
       <w:keepLines/>
-      <w:spacing w:before="120" w:after="50"/>
+      <w:spacing w:before="480" w:after="0"/>
       <w:outlineLvl w:val="0"/>
     </w:pPr>
     <w:rPr>
       <w:rFonts w:asciiTheme="majorHAnsi" w:eastAsiaTheme="majorEastAsia" w:hAnsiTheme="majorHAnsi" w:cstheme="majorBidi" w:ascii="Arial" w:hAnsi="Arial"/>
       <w:b/>
       <w:bCs/>
-      <w:caps/>
-      <w:color w:val="135F48"/>
+      <w:color w:val="181D1B"/>
       <w:sz w:val="21"/>
       <w:szCs w:val="28"/>
     </w:rPr>
@@ -982,15 +1401,15 @@
     <w:pPr>
       <w:keepNext/>
       <w:keepLines/>
-      <w:spacing w:before="70" w:after="10"/>
+      <w:spacing w:before="200" w:after="0"/>
       <w:outlineLvl w:val="1"/>
     </w:pPr>
     <w:rPr>
-      <w:rFonts w:asciiTheme="majorHAnsi" w:eastAsiaTheme="majorEastAsia" w:hAnsiTheme="majorHAnsi" w:cstheme="majorBidi" w:ascii="Arial" w:hAnsi="Arial"/>
+      <w:rFonts w:asciiTheme="majorHAnsi" w:eastAsiaTheme="majorEastAsia" w:hAnsiTheme="majorHAnsi" w:cstheme="majorBidi"/>
       <w:b/>
       <w:bCs/>
-      <w:color w:val="141F1B"/>
-      <w:sz w:val="18"/>
+      <w:color w:val="4F81BD" w:themeColor="accent1"/>
+      <w:sz w:val="26"/>
       <w:szCs w:val="26"/>
     </w:rPr>
   </w:style>
@@ -1253,10 +1672,10 @@
     <w:rPr>
       <w:rFonts w:asciiTheme="majorHAnsi" w:eastAsiaTheme="majorEastAsia" w:hAnsiTheme="majorHAnsi" w:cstheme="majorBidi" w:ascii="Arial" w:hAnsi="Arial"/>
       <w:b/>
-      <w:color w:val="0D2A22"/>
+      <w:color w:val="181D1B"/>
       <w:spacing w:val="5"/>
       <w:kern w:val="28"/>
-      <w:sz w:val="42"/>
+      <w:sz w:val="46"/>
       <w:szCs w:val="52"/>
     </w:rPr>
   </w:style>

</xml_diff>